<commit_message>
Update Frontend + Backend
</commit_message>
<xml_diff>
--- a/assets/drinks/TEA2.docx
+++ b/assets/drinks/TEA2.docx
@@ -1058,17 +1058,12 @@
         <w:t xml:space="preserve">Half </w:t>
       </w:r>
       <w:proofErr w:type="spellStart"/>
-      <w:proofErr w:type="gramStart"/>
       <w:r>
         <w:t>half</w:t>
       </w:r>
       <w:proofErr w:type="spellEnd"/>
       <w:r>
-        <w:t xml:space="preserve"> iced</w:t>
-      </w:r>
-      <w:proofErr w:type="gramEnd"/>
-      <w:r>
-        <w:t xml:space="preserve"> tea - Arizona</w:t>
+        <w:t xml:space="preserve"> iced tea - Arizona</w:t>
       </w:r>
       <w:r>
         <w:t>@4.30$@</w:t>
@@ -1114,12 +1109,14 @@
       <w:r>
         <w:t>, United States</w:t>
       </w:r>
+      <w:proofErr w:type="gramStart"/>
       <w:r>
         <w:t>@</w:t>
       </w:r>
       <w:r>
         <w:t xml:space="preserve"> !</w:t>
       </w:r>
+      <w:proofErr w:type="gramEnd"/>
     </w:p>
     <w:p>
       <w:pPr>
@@ -1597,16 +1594,22 @@
       </w:r>
     </w:p>
     <w:p>
-      <w:r>
-        <w:t>6.</w:t>
-      </w:r>
-      <w:r>
-        <w:t xml:space="preserve"> </w:t>
+      <w:pPr>
+        <w:rPr>
+          <w:lang w:val="es-ES"/>
+        </w:rPr>
+      </w:pPr>
+      <w:r>
+        <w:rPr>
+          <w:lang w:val="es-ES"/>
+        </w:rPr>
+        <w:t xml:space="preserve">6. </w:t>
       </w:r>
       <w:hyperlink r:id="rId24" w:history="1">
         <w:r>
           <w:rPr>
             <w:rStyle w:val="Hyperlink"/>
+            <w:lang w:val="es-ES"/>
           </w:rPr>
           <w:t>https://world.openfoodfacts.org/product/5942325000066/apa-plata-bucovina</w:t>
         </w:r>
@@ -2235,6 +2238,11 @@
       </w:r>
     </w:p>
     <w:p>
+      <w:pPr>
+        <w:rPr>
+          <w:lang w:val="es-ES"/>
+        </w:rPr>
+      </w:pPr>
       <w:r>
         <w:rPr>
           <w:lang w:val="es-ES"/>
@@ -2251,6 +2259,7 @@
         <w:r>
           <w:rPr>
             <w:rStyle w:val="Hyperlink"/>
+            <w:lang w:val="es-ES"/>
           </w:rPr>
           <w:t>https://world.openfoodfacts.org/product/0682430611744/voss-artesian-water</w:t>
         </w:r>
@@ -3482,24 +3491,70 @@
       </w:hyperlink>
     </w:p>
     <w:p>
-      <w:r>
-        <w:t xml:space="preserve">E-Drink Energy-Taste - Coop Prix </w:t>
-      </w:r>
-      <w:proofErr w:type="spellStart"/>
-      <w:r>
+      <w:pPr>
+        <w:rPr>
+          <w:lang w:val="es-ES"/>
+        </w:rPr>
+      </w:pPr>
+      <w:r>
+        <w:rPr>
+          <w:lang w:val="es-ES"/>
+        </w:rPr>
+        <w:t>E-</w:t>
+      </w:r>
+      <w:proofErr w:type="spellStart"/>
+      <w:r>
+        <w:rPr>
+          <w:lang w:val="es-ES"/>
+        </w:rPr>
+        <w:t>Drink</w:t>
+      </w:r>
+      <w:proofErr w:type="spellEnd"/>
+      <w:r>
+        <w:rPr>
+          <w:lang w:val="es-ES"/>
+        </w:rPr>
+        <w:t xml:space="preserve"> Energy-Taste - </w:t>
+      </w:r>
+      <w:proofErr w:type="spellStart"/>
+      <w:r>
+        <w:rPr>
+          <w:lang w:val="es-ES"/>
+        </w:rPr>
+        <w:t>Coop</w:t>
+      </w:r>
+      <w:proofErr w:type="spellEnd"/>
+      <w:r>
+        <w:rPr>
+          <w:lang w:val="es-ES"/>
+        </w:rPr>
+        <w:t xml:space="preserve"> Prix </w:t>
+      </w:r>
+      <w:proofErr w:type="spellStart"/>
+      <w:r>
+        <w:rPr>
+          <w:lang w:val="es-ES"/>
+        </w:rPr>
         <w:t>Garantie</w:t>
       </w:r>
       <w:proofErr w:type="spellEnd"/>
       <w:r>
+        <w:rPr>
+          <w:lang w:val="es-ES"/>
+        </w:rPr>
         <w:t xml:space="preserve"> - 250 </w:t>
       </w:r>
       <w:proofErr w:type="spellStart"/>
       <w:r>
+        <w:rPr>
+          <w:lang w:val="es-ES"/>
+        </w:rPr>
         <w:t>ml@</w:t>
       </w:r>
       <w:r>
         <w:rPr>
           <w:rFonts w:eastAsiaTheme="majorEastAsia" w:cstheme="minorHAnsi"/>
+          <w:lang w:val="es-ES"/>
         </w:rPr>
         <w:t>Energy</w:t>
       </w:r>
@@ -3507,21 +3562,188 @@
       <w:r>
         <w:rPr>
           <w:rFonts w:eastAsiaTheme="majorEastAsia" w:cstheme="minorHAnsi"/>
+          <w:lang w:val="es-ES"/>
         </w:rPr>
         <w:t xml:space="preserve"> Drink@</w:t>
       </w:r>
       <w:r>
-        <w:t>2.5$@250ml@water, acidifier (e 330), carbon dioxide, taurine (400mg/100ml), acidity corrector (e 331) aroma, caffeine, dye (e 150c), sweeteners (e 950, e 951), inositol, vitamin (niacin, b2, b6, b12)@France, Switzerland@ !</w:t>
-      </w:r>
-    </w:p>
-    <w:p>
-      <w:r>
+        <w:rPr>
+          <w:lang w:val="es-ES"/>
+        </w:rPr>
+        <w:t xml:space="preserve">2.5$@250ml@water, </w:t>
+      </w:r>
+      <w:proofErr w:type="spellStart"/>
+      <w:r>
+        <w:rPr>
+          <w:lang w:val="es-ES"/>
+        </w:rPr>
+        <w:t>acidifier</w:t>
+      </w:r>
+      <w:proofErr w:type="spellEnd"/>
+      <w:r>
+        <w:rPr>
+          <w:lang w:val="es-ES"/>
+        </w:rPr>
+        <w:t xml:space="preserve"> (e 330), </w:t>
+      </w:r>
+      <w:proofErr w:type="spellStart"/>
+      <w:r>
+        <w:rPr>
+          <w:lang w:val="es-ES"/>
+        </w:rPr>
+        <w:t>carbon</w:t>
+      </w:r>
+      <w:proofErr w:type="spellEnd"/>
+      <w:r>
+        <w:rPr>
+          <w:lang w:val="es-ES"/>
+        </w:rPr>
+        <w:t xml:space="preserve"> </w:t>
+      </w:r>
+      <w:proofErr w:type="spellStart"/>
+      <w:r>
+        <w:rPr>
+          <w:lang w:val="es-ES"/>
+        </w:rPr>
+        <w:t>dioxide</w:t>
+      </w:r>
+      <w:proofErr w:type="spellEnd"/>
+      <w:r>
+        <w:rPr>
+          <w:lang w:val="es-ES"/>
+        </w:rPr>
+        <w:t xml:space="preserve">, taurine (400mg/100ml), </w:t>
+      </w:r>
+      <w:proofErr w:type="spellStart"/>
+      <w:r>
+        <w:rPr>
+          <w:lang w:val="es-ES"/>
+        </w:rPr>
+        <w:t>acidity</w:t>
+      </w:r>
+      <w:proofErr w:type="spellEnd"/>
+      <w:r>
+        <w:rPr>
+          <w:lang w:val="es-ES"/>
+        </w:rPr>
+        <w:t xml:space="preserve"> corrector (e 331) aroma, </w:t>
+      </w:r>
+      <w:proofErr w:type="spellStart"/>
+      <w:r>
+        <w:rPr>
+          <w:lang w:val="es-ES"/>
+        </w:rPr>
+        <w:t>caffeine</w:t>
+      </w:r>
+      <w:proofErr w:type="spellEnd"/>
+      <w:r>
+        <w:rPr>
+          <w:lang w:val="es-ES"/>
+        </w:rPr>
+        <w:t xml:space="preserve">, </w:t>
+      </w:r>
+      <w:proofErr w:type="spellStart"/>
+      <w:r>
+        <w:rPr>
+          <w:lang w:val="es-ES"/>
+        </w:rPr>
+        <w:t>dye</w:t>
+      </w:r>
+      <w:proofErr w:type="spellEnd"/>
+      <w:r>
+        <w:rPr>
+          <w:lang w:val="es-ES"/>
+        </w:rPr>
+        <w:t xml:space="preserve"> (e 150c), </w:t>
+      </w:r>
+      <w:proofErr w:type="spellStart"/>
+      <w:r>
+        <w:rPr>
+          <w:lang w:val="es-ES"/>
+        </w:rPr>
+        <w:t>sweeteners</w:t>
+      </w:r>
+      <w:proofErr w:type="spellEnd"/>
+      <w:r>
+        <w:rPr>
+          <w:lang w:val="es-ES"/>
+        </w:rPr>
+        <w:t xml:space="preserve"> (e 950, e 951), inositol, </w:t>
+      </w:r>
+      <w:proofErr w:type="spellStart"/>
+      <w:r>
+        <w:rPr>
+          <w:lang w:val="es-ES"/>
+        </w:rPr>
+        <w:t>vitamin</w:t>
+      </w:r>
+      <w:proofErr w:type="spellEnd"/>
+      <w:r>
+        <w:rPr>
+          <w:lang w:val="es-ES"/>
+        </w:rPr>
+        <w:t xml:space="preserve"> (</w:t>
+      </w:r>
+      <w:proofErr w:type="spellStart"/>
+      <w:r>
+        <w:rPr>
+          <w:lang w:val="es-ES"/>
+        </w:rPr>
+        <w:t>niacin</w:t>
+      </w:r>
+      <w:proofErr w:type="spellEnd"/>
+      <w:r>
+        <w:rPr>
+          <w:lang w:val="es-ES"/>
+        </w:rPr>
+        <w:t>, b2, b6, b</w:t>
+      </w:r>
+      <w:proofErr w:type="gramStart"/>
+      <w:r>
+        <w:rPr>
+          <w:lang w:val="es-ES"/>
+        </w:rPr>
+        <w:t>12)@</w:t>
+      </w:r>
+      <w:proofErr w:type="gramEnd"/>
+      <w:r>
+        <w:rPr>
+          <w:lang w:val="es-ES"/>
+        </w:rPr>
+        <w:t xml:space="preserve">France, </w:t>
+      </w:r>
+      <w:proofErr w:type="spellStart"/>
+      <w:r>
+        <w:rPr>
+          <w:lang w:val="es-ES"/>
+        </w:rPr>
+        <w:t>Switzerland</w:t>
+      </w:r>
+      <w:proofErr w:type="spellEnd"/>
+      <w:r>
+        <w:rPr>
+          <w:lang w:val="es-ES"/>
+        </w:rPr>
+        <w:t>@ !</w:t>
+      </w:r>
+    </w:p>
+    <w:p>
+      <w:pPr>
+        <w:rPr>
+          <w:lang w:val="es-ES"/>
+        </w:rPr>
+      </w:pPr>
+      <w:r>
+        <w:rPr>
+          <w:lang w:val="es-ES"/>
+        </w:rPr>
         <w:t xml:space="preserve">7. </w:t>
       </w:r>
       <w:hyperlink r:id="rId42" w:history="1">
         <w:r>
           <w:rPr>
             <w:rStyle w:val="Hyperlink"/>
+            <w:lang w:val="es-ES"/>
           </w:rPr>
           <w:t>https://world.openfoodfacts.org/product/0786162080004/energy-water-tropical-vitaminwater</w:t>
         </w:r>
@@ -4335,33 +4557,30 @@
     </w:p>
     <w:p>
       <w:r>
-        <w:t xml:space="preserve">Cocktail essentials mint syrup - Master </w:t>
+        <w:t>Cocktail essentials mint syrup - Master Of Mixes@4$@375ml@</w:t>
+      </w:r>
+      <w:r>
+        <w:t>Syrup</w:t>
+      </w:r>
+      <w:r>
+        <w:t>@</w:t>
+      </w:r>
+      <w:r>
+        <w:t xml:space="preserve">High fructose corn syrup, water, sugar, natural flavor, natural spearmint oils, potassium </w:t>
+      </w:r>
+      <w:proofErr w:type="spellStart"/>
+      <w:r>
+        <w:t>sorbate@United</w:t>
+      </w:r>
+      <w:proofErr w:type="spellEnd"/>
+      <w:r>
+        <w:t xml:space="preserve"> States</w:t>
       </w:r>
       <w:proofErr w:type="gramStart"/>
       <w:r>
-        <w:t>Of</w:t>
+        <w:t>@ !</w:t>
       </w:r>
       <w:proofErr w:type="gramEnd"/>
-      <w:r>
-        <w:t xml:space="preserve"> Mixes@4$@375ml@</w:t>
-      </w:r>
-      <w:r>
-        <w:t>Syrup</w:t>
-      </w:r>
-      <w:r>
-        <w:t>@</w:t>
-      </w:r>
-      <w:r>
-        <w:t xml:space="preserve">High fructose corn syrup, water, sugar, natural flavor, natural spearmint oils, potassium </w:t>
-      </w:r>
-      <w:proofErr w:type="spellStart"/>
-      <w:r>
-        <w:t>sorbate@United</w:t>
-      </w:r>
-      <w:proofErr w:type="spellEnd"/>
-      <w:r>
-        <w:t xml:space="preserve"> States@ !</w:t>
-      </w:r>
     </w:p>
     <w:p>
       <w:r>
@@ -5055,7 +5274,10 @@
     </w:p>
     <w:p>
       <w:r>
-        <w:t xml:space="preserve">Coke Zero - Coca-Cola - 330 ml@2.25$@330ml@Soda@Carbonated Purified Water, </w:t>
+        <w:t>Coca-Cola Zero - 330ml</w:t>
+      </w:r>
+      <w:r>
+        <w:t xml:space="preserve">@2.25$@330ml@Soda@Carbonated Purified Water, </w:t>
       </w:r>
       <w:proofErr w:type="spellStart"/>
       <w:r>
@@ -5071,15 +5293,7 @@
       </w:r>
       <w:proofErr w:type="spellEnd"/>
       <w:r>
-        <w:t xml:space="preserve">, Sweeteners (E951, E950), Preservative (E211), </w:t>
-      </w:r>
-      <w:proofErr w:type="spellStart"/>
-      <w:r>
-        <w:t>Caffeine@Australia@Lidl</w:t>
-      </w:r>
-      <w:proofErr w:type="spellEnd"/>
-      <w:r>
-        <w:t>!</w:t>
+        <w:t>, Sweeteners (E951, E950), Preservative (E211), Caffeine@Australia@Lidl!</w:t>
       </w:r>
     </w:p>
     <w:p>
@@ -5093,46 +5307,6 @@
         <w:t xml:space="preserve"> </w:t>
       </w:r>
       <w:hyperlink r:id="rId64" w:history="1">
-        <w:r>
-          <w:rPr>
-            <w:rStyle w:val="Hyperlink"/>
-          </w:rPr>
-          <w:t>https://world.openfoodfacts.org/product/5449000131805/coca-cola-zero</w:t>
-        </w:r>
-      </w:hyperlink>
-    </w:p>
-    <w:p>
-      <w:r>
-        <w:t xml:space="preserve">Coca-Cola Zero - 330ml@3.14$@330ml@Soda@carbonated water, </w:t>
-      </w:r>
-      <w:proofErr w:type="spellStart"/>
-      <w:r>
-        <w:t>colour</w:t>
-      </w:r>
-      <w:proofErr w:type="spellEnd"/>
-      <w:r>
-        <w:t xml:space="preserve">: e150d, acidifiers: phosphoric acid, sodium citrate, sweeteners: aspartame, acesulfame </w:t>
-      </w:r>
-      <w:proofErr w:type="spellStart"/>
-      <w:r>
-        <w:t>k@France@Carrefour</w:t>
-      </w:r>
-      <w:proofErr w:type="spellEnd"/>
-      <w:r>
-        <w:t>!</w:t>
-      </w:r>
-    </w:p>
-    <w:p>
-      <w:r>
-        <w:t>7</w:t>
-      </w:r>
-      <w:r>
-        <w:t>.</w:t>
-      </w:r>
-      <w:r>
-        <w:t xml:space="preserve"> </w:t>
-      </w:r>
-      <w:hyperlink r:id="rId65" w:history="1">
         <w:r>
           <w:rPr>
             <w:rStyle w:val="Hyperlink"/>
@@ -5172,7 +5346,7 @@
     </w:p>
     <w:p>
       <w:r>
-        <w:t>8</w:t>
+        <w:t>7</w:t>
       </w:r>
       <w:r>
         <w:t>.</w:t>
@@ -5180,7 +5354,7 @@
       <w:r>
         <w:t xml:space="preserve"> </w:t>
       </w:r>
-      <w:hyperlink r:id="rId66" w:history="1">
+      <w:hyperlink r:id="rId65" w:history="1">
         <w:r>
           <w:rPr>
             <w:rStyle w:val="Hyperlink"/>
@@ -5412,7 +5586,7 @@
       <w:r>
         <w:t xml:space="preserve"> </w:t>
       </w:r>
-      <w:hyperlink r:id="rId67" w:history="1">
+      <w:hyperlink r:id="rId66" w:history="1">
         <w:r>
           <w:rPr>
             <w:rStyle w:val="Hyperlink"/>
@@ -5457,24 +5631,12 @@
       <w:r>
         <w:t xml:space="preserve"> </w:t>
       </w:r>
-      <w:hyperlink r:id="rId68" w:history="1">
+      <w:hyperlink r:id="rId67" w:history="1">
         <w:r>
           <w:rPr>
             <w:rStyle w:val="Hyperlink"/>
           </w:rPr>
-          <w:t>https://world.open</w:t>
-        </w:r>
-        <w:r>
-          <w:rPr>
-            <w:rStyle w:val="Hyperlink"/>
-          </w:rPr>
-          <w:t>f</w:t>
-        </w:r>
-        <w:r>
-          <w:rPr>
-            <w:rStyle w:val="Hyperlink"/>
-          </w:rPr>
-          <w:t>oodfacts.org/product/5010029217933/weetabix-on-the-go-chocolate</w:t>
+          <w:t>https://world.openfoodfacts.org/product/5010029217933/weetabix-on-the-go-chocolate</w:t>
         </w:r>
       </w:hyperlink>
     </w:p>
@@ -5535,13 +5697,12 @@
     <w:p/>
     <w:p>
       <w:r>
-        <w:lastRenderedPageBreak/>
         <w:t>3.</w:t>
       </w:r>
       <w:r>
         <w:t xml:space="preserve"> </w:t>
       </w:r>
-      <w:hyperlink r:id="rId69" w:history="1">
+      <w:hyperlink r:id="rId68" w:history="1">
         <w:r>
           <w:rPr>
             <w:rStyle w:val="Hyperlink"/>
@@ -5551,6 +5712,11 @@
       </w:hyperlink>
     </w:p>
     <w:p>
+      <w:pPr>
+        <w:rPr>
+          <w:lang w:val="es-ES"/>
+        </w:rPr>
+      </w:pPr>
       <w:r>
         <w:t>Chocolate drink - fairlife@2.5$@340ml@</w:t>
       </w:r>
@@ -5558,76 +5724,321 @@
         <w:t>Dairy@</w:t>
       </w:r>
       <w:r>
-        <w:t xml:space="preserve">Lowfat Milk, Alkalized Cocoa, Natural Flavors, Microcrystalline Cellulose, Cellulose Gum, Salt, Carrageenan, Lactase Enzyme, Monk Fruit Extract, Acesulfame Potassium. Sucralose, Stevia Extract, Maltodextrin, Vitamin a (Palmitate), Vitamin D3@United </w:t>
-      </w:r>
-      <w:proofErr w:type="spellStart"/>
-      <w:r>
+        <w:t xml:space="preserve">Lowfat Milk, Alkalized Cocoa, Natural Flavors, Microcrystalline Cellulose, Cellulose Gum, Salt, Carrageenan, Lactase Enzyme, Monk Fruit Extract, </w:t>
+      </w:r>
+      <w:r>
+        <w:lastRenderedPageBreak/>
+        <w:t xml:space="preserve">Acesulfame Potassium. </w:t>
+      </w:r>
+      <w:proofErr w:type="spellStart"/>
+      <w:r>
+        <w:rPr>
+          <w:lang w:val="es-ES"/>
+        </w:rPr>
+        <w:t>Sucralose</w:t>
+      </w:r>
+      <w:proofErr w:type="spellEnd"/>
+      <w:r>
+        <w:rPr>
+          <w:lang w:val="es-ES"/>
+        </w:rPr>
+        <w:t xml:space="preserve">, Stevia </w:t>
+      </w:r>
+      <w:proofErr w:type="spellStart"/>
+      <w:r>
+        <w:rPr>
+          <w:lang w:val="es-ES"/>
+        </w:rPr>
+        <w:t>Extract</w:t>
+      </w:r>
+      <w:proofErr w:type="spellEnd"/>
+      <w:r>
+        <w:rPr>
+          <w:lang w:val="es-ES"/>
+        </w:rPr>
+        <w:t xml:space="preserve">, </w:t>
+      </w:r>
+      <w:proofErr w:type="spellStart"/>
+      <w:r>
+        <w:rPr>
+          <w:lang w:val="es-ES"/>
+        </w:rPr>
+        <w:t>Maltodextrin</w:t>
+      </w:r>
+      <w:proofErr w:type="spellEnd"/>
+      <w:r>
+        <w:rPr>
+          <w:lang w:val="es-ES"/>
+        </w:rPr>
+        <w:t xml:space="preserve">, </w:t>
+      </w:r>
+      <w:proofErr w:type="spellStart"/>
+      <w:r>
+        <w:rPr>
+          <w:lang w:val="es-ES"/>
+        </w:rPr>
+        <w:t>Vitamin</w:t>
+      </w:r>
+      <w:proofErr w:type="spellEnd"/>
+      <w:r>
+        <w:rPr>
+          <w:lang w:val="es-ES"/>
+        </w:rPr>
+        <w:t xml:space="preserve"> a (</w:t>
+      </w:r>
+      <w:proofErr w:type="spellStart"/>
+      <w:r>
+        <w:rPr>
+          <w:lang w:val="es-ES"/>
+        </w:rPr>
+        <w:t>Palmitate</w:t>
+      </w:r>
+      <w:proofErr w:type="spellEnd"/>
+      <w:r>
+        <w:rPr>
+          <w:lang w:val="es-ES"/>
+        </w:rPr>
+        <w:t xml:space="preserve">), </w:t>
+      </w:r>
+      <w:proofErr w:type="spellStart"/>
+      <w:r>
+        <w:rPr>
+          <w:lang w:val="es-ES"/>
+        </w:rPr>
+        <w:t>Vitamin</w:t>
+      </w:r>
+      <w:proofErr w:type="spellEnd"/>
+      <w:r>
+        <w:rPr>
+          <w:lang w:val="es-ES"/>
+        </w:rPr>
+        <w:t xml:space="preserve"> D3@United </w:t>
+      </w:r>
+      <w:proofErr w:type="spellStart"/>
+      <w:r>
+        <w:rPr>
+          <w:lang w:val="es-ES"/>
+        </w:rPr>
         <w:t>States@Wal-Mart</w:t>
       </w:r>
       <w:proofErr w:type="spellEnd"/>
       <w:r>
+        <w:rPr>
+          <w:lang w:val="es-ES"/>
+        </w:rPr>
         <w:t>!</w:t>
       </w:r>
     </w:p>
-    <w:p/>
-    <w:p>
-      <w:r>
-        <w:t>4.</w:t>
-      </w:r>
-      <w:r>
-        <w:t xml:space="preserve"> </w:t>
+    <w:p>
+      <w:pPr>
+        <w:rPr>
+          <w:lang w:val="es-ES"/>
+        </w:rPr>
+      </w:pPr>
+    </w:p>
+    <w:p>
+      <w:pPr>
+        <w:rPr>
+          <w:lang w:val="es-ES"/>
+        </w:rPr>
+      </w:pPr>
+      <w:r>
+        <w:rPr>
+          <w:lang w:val="es-ES"/>
+        </w:rPr>
+        <w:t xml:space="preserve">4. </w:t>
+      </w:r>
+      <w:hyperlink r:id="rId69" w:history="1">
+        <w:r>
+          <w:rPr>
+            <w:rStyle w:val="Hyperlink"/>
+            <w:lang w:val="es-ES"/>
+          </w:rPr>
+          <w:t>https://world.openfoodfacts.org/product/5601226003469/ucal-chocolate-milk</w:t>
+        </w:r>
+      </w:hyperlink>
+    </w:p>
+    <w:p>
+      <w:pPr>
+        <w:rPr>
+          <w:lang w:val="es-ES"/>
+        </w:rPr>
+      </w:pPr>
+      <w:proofErr w:type="spellStart"/>
+      <w:r>
+        <w:rPr>
+          <w:lang w:val="es-ES"/>
+        </w:rPr>
+        <w:t>Ucal</w:t>
+      </w:r>
+      <w:proofErr w:type="spellEnd"/>
+      <w:r>
+        <w:rPr>
+          <w:lang w:val="es-ES"/>
+        </w:rPr>
+        <w:t xml:space="preserve"> chocolate </w:t>
+      </w:r>
+      <w:proofErr w:type="spellStart"/>
+      <w:r>
+        <w:rPr>
+          <w:lang w:val="es-ES"/>
+        </w:rPr>
+        <w:t>milk</w:t>
+      </w:r>
+      <w:proofErr w:type="spellEnd"/>
+      <w:r>
+        <w:rPr>
+          <w:lang w:val="es-ES"/>
+        </w:rPr>
+        <w:t xml:space="preserve"> - 250 ml@2.4$@250ml@Dairy@Milk (1,1% </w:t>
+      </w:r>
+      <w:proofErr w:type="spellStart"/>
+      <w:r>
+        <w:rPr>
+          <w:lang w:val="es-ES"/>
+        </w:rPr>
+        <w:t>fat</w:t>
+      </w:r>
+      <w:proofErr w:type="spellEnd"/>
+      <w:r>
+        <w:rPr>
+          <w:lang w:val="es-ES"/>
+        </w:rPr>
+        <w:t xml:space="preserve">), </w:t>
+      </w:r>
+      <w:proofErr w:type="spellStart"/>
+      <w:r>
+        <w:rPr>
+          <w:lang w:val="es-ES"/>
+        </w:rPr>
+        <w:t>sugar</w:t>
+      </w:r>
+      <w:proofErr w:type="spellEnd"/>
+      <w:r>
+        <w:rPr>
+          <w:lang w:val="es-ES"/>
+        </w:rPr>
+        <w:t xml:space="preserve">, cocoa (1%), </w:t>
+      </w:r>
+      <w:proofErr w:type="spellStart"/>
+      <w:r>
+        <w:rPr>
+          <w:lang w:val="es-ES"/>
+        </w:rPr>
+        <w:t>salt</w:t>
+      </w:r>
+      <w:proofErr w:type="spellEnd"/>
+      <w:r>
+        <w:rPr>
+          <w:lang w:val="es-ES"/>
+        </w:rPr>
+        <w:t xml:space="preserve">, </w:t>
+      </w:r>
+      <w:proofErr w:type="spellStart"/>
+      <w:r>
+        <w:rPr>
+          <w:lang w:val="es-ES"/>
+        </w:rPr>
+        <w:t>stabilizer</w:t>
+      </w:r>
+      <w:proofErr w:type="spellEnd"/>
+      <w:r>
+        <w:rPr>
+          <w:lang w:val="es-ES"/>
+        </w:rPr>
+        <w:t xml:space="preserve"> (E-407) and </w:t>
+      </w:r>
+      <w:proofErr w:type="spellStart"/>
+      <w:r>
+        <w:rPr>
+          <w:lang w:val="es-ES"/>
+        </w:rPr>
+        <w:t>flavouring@France</w:t>
+      </w:r>
+      <w:proofErr w:type="spellEnd"/>
+      <w:r>
+        <w:rPr>
+          <w:lang w:val="es-ES"/>
+        </w:rPr>
+        <w:t xml:space="preserve">, Portugal, </w:t>
+      </w:r>
+      <w:proofErr w:type="spellStart"/>
+      <w:r>
+        <w:rPr>
+          <w:lang w:val="es-ES"/>
+        </w:rPr>
+        <w:t>Switzerland@Asda</w:t>
+      </w:r>
+      <w:proofErr w:type="spellEnd"/>
+      <w:r>
+        <w:rPr>
+          <w:lang w:val="es-ES"/>
+        </w:rPr>
+        <w:t>!</w:t>
+      </w:r>
+    </w:p>
+    <w:p>
+      <w:pPr>
+        <w:rPr>
+          <w:lang w:val="es-ES"/>
+        </w:rPr>
+      </w:pPr>
+    </w:p>
+    <w:p>
+      <w:pPr>
+        <w:rPr>
+          <w:lang w:val="es-ES"/>
+        </w:rPr>
+      </w:pPr>
+      <w:r>
+        <w:rPr>
+          <w:lang w:val="es-ES"/>
+        </w:rPr>
+        <w:t xml:space="preserve">5. </w:t>
       </w:r>
       <w:hyperlink r:id="rId70" w:history="1">
         <w:r>
           <w:rPr>
             <w:rStyle w:val="Hyperlink"/>
+            <w:lang w:val="es-ES"/>
           </w:rPr>
-          <w:t>https://</w:t>
-        </w:r>
-        <w:r>
-          <w:rPr>
-            <w:rStyle w:val="Hyperlink"/>
-          </w:rPr>
-          <w:t>w</w:t>
-        </w:r>
-        <w:r>
-          <w:rPr>
-            <w:rStyle w:val="Hyperlink"/>
-          </w:rPr>
-          <w:t>orld.openfoodfacts.org/product/5601226003469/ucal-chocolate-milk</w:t>
+          <w:t>https://world.openfoodfacts.org/product/5760466920537/seattle-latte-starbucks</w:t>
         </w:r>
       </w:hyperlink>
     </w:p>
     <w:p>
-      <w:proofErr w:type="spellStart"/>
-      <w:r>
-        <w:t>Ucal</w:t>
-      </w:r>
-      <w:proofErr w:type="spellEnd"/>
-      <w:r>
-        <w:t xml:space="preserve"> chocolate milk - 250 ml@2.4$@250ml@Dairy@Milk (1,1% fat), sugar, cocoa (1%), salt, stabilizer (E-407) and </w:t>
-      </w:r>
-      <w:proofErr w:type="spellStart"/>
-      <w:r>
-        <w:t>flavouring@France</w:t>
-      </w:r>
-      <w:proofErr w:type="spellEnd"/>
-      <w:r>
-        <w:t xml:space="preserve">, Portugal, </w:t>
-      </w:r>
-      <w:proofErr w:type="spellStart"/>
-      <w:r>
-        <w:t>Switzerland@Asda</w:t>
-      </w:r>
-      <w:proofErr w:type="spellEnd"/>
-      <w:r>
-        <w:t>!</w:t>
+      <w:r>
+        <w:t xml:space="preserve">Seattle Latte - Starbucks - 220ml@8$@220ml@Dairy@lait (contains 3,1% fat) (75%), fairtrade certified arabica coffee (water, coffee extract 0,94%), sugar (4,8%), natural coffee aroma, acidity corrector: potassium carbonates, stabilizers: </w:t>
+      </w:r>
+      <w:proofErr w:type="spellStart"/>
+      <w:r>
+        <w:t>carraenas</w:t>
+      </w:r>
+      <w:proofErr w:type="spellEnd"/>
+      <w:r>
+        <w:t xml:space="preserve">, guar gum, emulsifier: mono and fatty acid </w:t>
+      </w:r>
+      <w:proofErr w:type="spellStart"/>
+      <w:r>
+        <w:t>diglycerides@Austria</w:t>
+      </w:r>
+      <w:proofErr w:type="spellEnd"/>
+      <w:r>
+        <w:t xml:space="preserve">, France, Germany, </w:t>
+      </w:r>
+      <w:proofErr w:type="spellStart"/>
+      <w:r>
+        <w:t>Switzerland@Palace</w:t>
+      </w:r>
+      <w:proofErr w:type="spellEnd"/>
+      <w:r>
+        <w:t xml:space="preserve"> Mall!</w:t>
       </w:r>
     </w:p>
     <w:p/>
     <w:p>
       <w:r>
-        <w:t>5.</w:t>
+        <w:t>6.</w:t>
       </w:r>
       <w:r>
         <w:t xml:space="preserve"> </w:t>
@@ -5637,101 +6048,31 @@
           <w:rPr>
             <w:rStyle w:val="Hyperlink"/>
           </w:rPr>
-          <w:t>https://world.openfoodfacts.org</w:t>
-        </w:r>
-        <w:r>
-          <w:rPr>
-            <w:rStyle w:val="Hyperlink"/>
-          </w:rPr>
-          <w:t>/</w:t>
-        </w:r>
-        <w:r>
-          <w:rPr>
-            <w:rStyle w:val="Hyperlink"/>
-          </w:rPr>
-          <w:t>product/5760466920537/seattle-latte-starbucks</w:t>
+          <w:t>https://world.openfoodfacts.org/product/7610900066995/energy-milk-new-26g-high-protein-vanilla-emmi</w:t>
         </w:r>
       </w:hyperlink>
     </w:p>
     <w:p>
       <w:r>
-        <w:t xml:space="preserve">Seattle Latte - Starbucks - 220ml@8$@220ml@Dairy@lait (contains 3,1% fat) (75%), fairtrade certified arabica coffee (water, coffee extract 0,94%), sugar (4,8%), natural coffee aroma, acidity corrector: potassium carbonates, stabilizers: </w:t>
-      </w:r>
-      <w:proofErr w:type="spellStart"/>
-      <w:r>
-        <w:t>carraenas</w:t>
-      </w:r>
-      <w:proofErr w:type="spellEnd"/>
-      <w:r>
-        <w:t xml:space="preserve">, guar gum, emulsifier: mono and fatty acid </w:t>
-      </w:r>
-      <w:proofErr w:type="spellStart"/>
-      <w:r>
-        <w:t>diglycerides@Austria</w:t>
-      </w:r>
-      <w:proofErr w:type="spellEnd"/>
-      <w:r>
-        <w:t xml:space="preserve">, France, Germany, </w:t>
-      </w:r>
-      <w:proofErr w:type="spellStart"/>
-      <w:r>
-        <w:t>Switzerland@Palace</w:t>
-      </w:r>
-      <w:proofErr w:type="spellEnd"/>
-      <w:r>
-        <w:t xml:space="preserve"> Mall!</w:t>
-      </w:r>
-    </w:p>
-    <w:p/>
-    <w:p>
-      <w:r>
-        <w:t>6.</w:t>
+        <w:t xml:space="preserve">Energy Milk New 26g High Protein Vanilla - Emmi@2.4$@330ml@Partly skimmed milk, milk protein, sugar, dextrose, vanilla extract, flavoring, stabilizer E331, carrageenan thickener, carrot juice concentrate, vitamins E, B6, B2, B1, </w:t>
+      </w:r>
+      <w:proofErr w:type="spellStart"/>
+      <w:r>
+        <w:t>D@France</w:t>
+      </w:r>
+      <w:proofErr w:type="spellEnd"/>
+      <w:r>
+        <w:t>, Switzerland@ !</w:t>
+      </w:r>
+    </w:p>
+    <w:p>
+      <w:r>
+        <w:t>7.</w:t>
       </w:r>
       <w:r>
         <w:t xml:space="preserve"> </w:t>
       </w:r>
       <w:hyperlink r:id="rId72" w:history="1">
-        <w:r>
-          <w:rPr>
-            <w:rStyle w:val="Hyperlink"/>
-          </w:rPr>
-          <w:t>https://world.o</w:t>
-        </w:r>
-        <w:r>
-          <w:rPr>
-            <w:rStyle w:val="Hyperlink"/>
-          </w:rPr>
-          <w:t>p</w:t>
-        </w:r>
-        <w:r>
-          <w:rPr>
-            <w:rStyle w:val="Hyperlink"/>
-          </w:rPr>
-          <w:t>enfoodfacts.org/product/7610900066995/energy-milk-new-26g-high-protein-vanilla-emmi</w:t>
-        </w:r>
-      </w:hyperlink>
-    </w:p>
-    <w:p>
-      <w:r>
-        <w:t xml:space="preserve">Energy Milk New 26g High Protein Vanilla - Emmi@2.4$@330ml@Partly skimmed milk, milk protein, sugar, dextrose, vanilla extract, flavoring, stabilizer E331, carrageenan thickener, carrot juice concentrate, vitamins E, B6, B2, B1, </w:t>
-      </w:r>
-      <w:proofErr w:type="spellStart"/>
-      <w:r>
-        <w:t>D@France</w:t>
-      </w:r>
-      <w:proofErr w:type="spellEnd"/>
-      <w:r>
-        <w:t>, Switzerland@ !</w:t>
-      </w:r>
-    </w:p>
-    <w:p>
-      <w:r>
-        <w:t>7.</w:t>
-      </w:r>
-      <w:r>
-        <w:t xml:space="preserve"> </w:t>
-      </w:r>
-      <w:hyperlink r:id="rId73" w:history="1">
         <w:r>
           <w:rPr>
             <w:rStyle w:val="Hyperlink"/>

</xml_diff>